<commit_message>
Add 26 UI tests and update all architecture/walkthrough/strategy docs
Co-Authored-By: Claude Sonnet 4.6 <noreply@anthropic.com>
</commit_message>
<xml_diff>
--- a/ARCHITECTURE.docx
+++ b/ARCHITECTURE.docx
@@ -2976,6 +2976,79 @@
           <w:szCs w:val="18"/>
         </w:rPr>
         <w:t xml:space="preserve">github.com/shahraj91/video-transcriber</w:t>
+      </w:r>
+    </w:p>
+    <w:p>
+      <w:r>
+        <w:rPr>
+          <w:b/>
+          <w:sz w:val="28"/>
+        </w:rPr>
+        <w:t>Web UI Layer</w:t>
+      </w:r>
+    </w:p>
+    <w:p>
+      <w:r>
+        <w:rPr>
+          <w:b/>
+        </w:rPr>
+        <w:t>ui.py — Streamlit Web Interface</w:t>
+      </w:r>
+    </w:p>
+    <w:p>
+      <w:r>
+        <w:rPr>
+          <w:b w:val="0"/>
+        </w:rPr>
+        <w:t>The pipeline is exposed as a browser-based web UI via Streamlit. ui.py is a thin orchestration layer on top of the same pipeline classes — no logic is duplicated. All processing remains fully local.</w:t>
+      </w:r>
+    </w:p>
+    <w:p>
+      <w:r>
+        <w:rPr>
+          <w:b w:val="0"/>
+        </w:rPr>
+        <w:t>run_pipeline() is a Python generator that yields ('step', message) events at each pipeline stage and a final ('done', (results, out_dir)) event. This drives Streamlit's st.status() live progress display without blocking.</w:t>
+      </w:r>
+    </w:p>
+    <w:p>
+      <w:r>
+        <w:rPr>
+          <w:b/>
+        </w:rPr>
+        <w:t>UI zones:</w:t>
+      </w:r>
+    </w:p>
+    <w:p>
+      <w:r>
+        <w:rPr>
+          <w:b w:val="0"/>
+        </w:rPr>
+        <w:t>Sidebar — Whisper model selector, Ollama model input, Llama feature toggles (speakers, summary, action items), translation language. Checkboxes disabled when Llama toggle is off.</w:t>
+      </w:r>
+    </w:p>
+    <w:p>
+      <w:r>
+        <w:rPr>
+          <w:b w:val="0"/>
+        </w:rPr>
+        <w:t>Main area — video uploader and Transcribe button (disabled until a file is chosen). Uploaded file saved to a named temp file so OutputManager gets a proper stem.</w:t>
+      </w:r>
+    </w:p>
+    <w:p>
+      <w:r>
+        <w:rPr>
+          <w:b w:val="0"/>
+        </w:rPr>
+        <w:t>Results — tabbed view per output file, per-file download button, and Download all as ZIP. Results stored in st.session_state to persist across reruns.</w:t>
+      </w:r>
+    </w:p>
+    <w:p>
+      <w:r>
+        <w:rPr>
+          <w:b w:val="0"/>
+        </w:rPr>
+        <w:t>Streamlit server: http://localhost:8501. First-run prompt suppressed via ~/.streamlit/credentials.toml.</w:t>
       </w:r>
     </w:p>
     <w:sectPr>

</xml_diff>